<commit_message>
update skills set styles
</commit_message>
<xml_diff>
--- a/examples/Diego_Style_Category_Bullets_Template.docx
+++ b/examples/Diego_Style_Category_Bullets_Template.docx
@@ -89,6 +89,12 @@
           <w:sz w:val="20"/>
         </w:rPr>
         <w:t>{{ phone }}</w:t>
+      </w:r>
+      <w:r>
+        <w:rPr>
+          <w:b/>
+        </w:rPr>
+        <w:t xml:space="preserve"> | {{ linkedin }}</w:t>
       </w:r>
     </w:p>
     <w:p>

</xml_diff>